<commit_message>
Update docs for the walk-forward result and CI hosting
The analysis now leads with walk-forward rather than the contaminated
full-history figures: across seven out-of-sample windows, buy and hold
compounded 1,098.8% against fixed 5/150's 916.9%, and three different
parameter pairs won the fit windows. The sweep's apparent edge is noise and
the parameters stay put.

The project documentation records that hosting, the dead-man's switch, the
Python upgrade and walk-forward are all closed. The only item genuinely still
open is that the strategy is not worth funding as it stands.
</commit_message>
<xml_diff>
--- a/docs/Trading-Bot-Project-Documentation.docx
+++ b/docs/Trading-Bot-Project-Documentation.docx
@@ -71,7 +71,7 @@
                 <w:sz w:val="21"/>
                 <w:szCs w:val="21"/>
               </w:rPr>
-              <w:t xml:space="preserve">Running in paper mode. Not finished.</w:t>
+              <w:t xml:space="preserve">Running on GitHub Actions in paper mode.</w:t>
             </w:r>
           </w:p>
           <w:p>
@@ -83,7 +83,7 @@
                 <w:sz w:val="20"/>
                 <w:szCs w:val="20"/>
               </w:rPr>
-              <w:t xml:space="preserve">The bot runs daily, fetches validated prices, applies the strategy, executes against a simulated account and reports by push notification. All five planned phases are complete. Five items remain open — see section 8 — of which two block any move to real money.</w:t>
+              <w:t xml:space="preserve">The bot runs daily in CI, fetches validated prices, applies the strategy, executes against a simulated account and reports by push notification. It no longer depends on any one machine being switched on. All planned work is complete, including walk-forward validation — whose result is that this strategy should not be traded with real money. See section 8.</w:t>
             </w:r>
           </w:p>
         </w:tc>
@@ -519,7 +519,7 @@
         <w:spacing w:after="0" w:before="40"/>
       </w:pPr>
       <w:r>
-        <w:t xml:space="preserve">launchd  ── boot/login, 08:00, 20:00 ──►  run_daily.sh</w:t>
+        <w:t xml:space="preserve">GitHub Actions ── daily 07:00 UTC ──►  live_bot.py   (primary runner)</w:t>
       </w:r>
     </w:p>
     <w:p>
@@ -529,7 +529,7 @@
         <w:spacing w:after="0" w:before="0"/>
       </w:pPr>
       <w:r>
-        <w:t xml:space="preserve">                                            │</w:t>
+        <w:t xml:space="preserve">launchd ── boot, 08:00, 20:00 ──► run_daily.sh  (local, now disabled)</w:t>
       </w:r>
     </w:p>
     <w:p>
@@ -539,7 +539,7 @@
         <w:spacing w:after="0" w:before="0"/>
       </w:pPr>
       <w:r>
-        <w:t xml:space="preserve">                          idempotency guard ┤  (ran today already? stop)</w:t>
+        <w:t xml:space="preserve">                                            │</w:t>
       </w:r>
     </w:p>
     <w:p>
@@ -549,7 +549,7 @@
         <w:spacing w:after="0" w:before="0"/>
       </w:pPr>
       <w:r>
-        <w:t xml:space="preserve">                                            ▼</w:t>
+        <w:t xml:space="preserve">                          idempotency guard ┤  (ran today already? stop)</w:t>
       </w:r>
     </w:p>
     <w:p>
@@ -559,7 +559,7 @@
         <w:spacing w:after="0" w:before="0"/>
       </w:pPr>
       <w:r>
-        <w:t xml:space="preserve">                                      live_bot.py</w:t>
+        <w:t xml:space="preserve">                                            ▼</w:t>
       </w:r>
     </w:p>
     <w:p>
@@ -569,7 +569,7 @@
         <w:spacing w:after="0" w:before="0"/>
       </w:pPr>
       <w:r>
-        <w:t xml:space="preserve">                                            │</w:t>
+        <w:t xml:space="preserve">                                      live_bot.py</w:t>
       </w:r>
     </w:p>
     <w:p>
@@ -579,7 +579,17 @@
         <w:spacing w:after="0" w:before="0"/>
       </w:pPr>
       <w:r>
-        <w:t xml:space="preserve">        data.py  ◄─────────────────────┤  prices  (Kraken → Coinbase → yfinance)</w:t>
+        <w:t xml:space="preserve">                                            │</w:t>
+      </w:r>
+    </w:p>
+    <w:p>
+      <w:pPr>
+        <w:pStyle w:val="Code"/>
+        <w:shd w:fill="F2F5F7" w:val="clear"/>
+        <w:spacing w:after="0" w:before="0"/>
+      </w:pPr>
+      <w:r>
+        <w:t xml:space="preserve">        data.py  ◄────────────────────┤  prices  (Kraken → Coinbase)</w:t>
       </w:r>
     </w:p>
     <w:p>
@@ -891,7 +901,7 @@
                 <w:sz w:val="19"/>
                 <w:szCs w:val="19"/>
               </w:rPr>
-              <w:t xml:space="preserve">Live prices with three sources, retries, and validation</w:t>
+              <w:t xml:space="preserve">Live prices: Kraken then Coinbase, retries, validation</w:t>
             </w:r>
           </w:p>
         </w:tc>
@@ -1406,6 +1416,168 @@
                 <w:sz w:val="19"/>
                 <w:szCs w:val="19"/>
               </w:rPr>
+              <w:t xml:space="preserve">walkforward.py</w:t>
+            </w:r>
+          </w:p>
+        </w:tc>
+        <w:tc>
+          <w:tcPr>
+            <w:tcW w:type="dxa" w:w="1008"/>
+            <w:shd w:fill="FFFFFF" w:val="clear"/>
+            <w:tcMar>
+              <w:top w:type="dxa" w:w="90"/>
+              <w:left w:type="dxa" w:w="130"/>
+              <w:bottom w:type="dxa" w:w="90"/>
+              <w:right w:type="dxa" w:w="130"/>
+            </w:tcMar>
+          </w:tcPr>
+          <w:p>
+            <w:pPr>
+              <w:spacing w:after="0" w:line="252"/>
+              <w:jc w:val="right"/>
+            </w:pPr>
+            <w:r>
+              <w:rPr>
+                <w:color w:val="1A1A1A"/>
+                <w:sz w:val="19"/>
+                <w:szCs w:val="19"/>
+              </w:rPr>
+              <w:t xml:space="preserve">224</w:t>
+            </w:r>
+          </w:p>
+        </w:tc>
+        <w:tc>
+          <w:tcPr>
+            <w:tcW w:type="dxa" w:w="6653"/>
+            <w:shd w:fill="FFFFFF" w:val="clear"/>
+            <w:tcMar>
+              <w:top w:type="dxa" w:w="90"/>
+              <w:left w:type="dxa" w:w="130"/>
+              <w:bottom w:type="dxa" w:w="90"/>
+              <w:right w:type="dxa" w:w="130"/>
+            </w:tcMar>
+          </w:tcPr>
+          <w:p>
+            <w:pPr>
+              <w:spacing w:after="0" w:line="252"/>
+              <w:jc w:val="left"/>
+            </w:pPr>
+            <w:r>
+              <w:rPr>
+                <w:color w:val="1A1A1A"/>
+                <w:sz w:val="19"/>
+                <w:szCs w:val="19"/>
+              </w:rPr>
+              <w:t xml:space="preserve">Rolling out-of-sample validation — the honest test</w:t>
+            </w:r>
+          </w:p>
+        </w:tc>
+      </w:tr>
+      <w:tr>
+        <w:tc>
+          <w:tcPr>
+            <w:tcW w:type="dxa" w:w="2419"/>
+            <w:shd w:fill="F6F9FA" w:val="clear"/>
+            <w:tcMar>
+              <w:top w:type="dxa" w:w="90"/>
+              <w:left w:type="dxa" w:w="130"/>
+              <w:bottom w:type="dxa" w:w="90"/>
+              <w:right w:type="dxa" w:w="130"/>
+            </w:tcMar>
+          </w:tcPr>
+          <w:p>
+            <w:pPr>
+              <w:spacing w:after="0" w:line="252"/>
+              <w:jc w:val="left"/>
+            </w:pPr>
+            <w:r>
+              <w:rPr>
+                <w:rFonts w:ascii="Consolas" w:cs="Consolas" w:eastAsia="Consolas" w:hAnsi="Consolas"/>
+                <w:color w:val="1A1A1A"/>
+                <w:sz w:val="19"/>
+                <w:szCs w:val="19"/>
+              </w:rPr>
+              <w:t xml:space="preserve">health.py</w:t>
+            </w:r>
+          </w:p>
+        </w:tc>
+        <w:tc>
+          <w:tcPr>
+            <w:tcW w:type="dxa" w:w="1008"/>
+            <w:shd w:fill="F6F9FA" w:val="clear"/>
+            <w:tcMar>
+              <w:top w:type="dxa" w:w="90"/>
+              <w:left w:type="dxa" w:w="130"/>
+              <w:bottom w:type="dxa" w:w="90"/>
+              <w:right w:type="dxa" w:w="130"/>
+            </w:tcMar>
+          </w:tcPr>
+          <w:p>
+            <w:pPr>
+              <w:spacing w:after="0" w:line="252"/>
+              <w:jc w:val="right"/>
+            </w:pPr>
+            <w:r>
+              <w:rPr>
+                <w:color w:val="1A1A1A"/>
+                <w:sz w:val="19"/>
+                <w:szCs w:val="19"/>
+              </w:rPr>
+              <w:t xml:space="preserve">55</w:t>
+            </w:r>
+          </w:p>
+        </w:tc>
+        <w:tc>
+          <w:tcPr>
+            <w:tcW w:type="dxa" w:w="6653"/>
+            <w:shd w:fill="F6F9FA" w:val="clear"/>
+            <w:tcMar>
+              <w:top w:type="dxa" w:w="90"/>
+              <w:left w:type="dxa" w:w="130"/>
+              <w:bottom w:type="dxa" w:w="90"/>
+              <w:right w:type="dxa" w:w="130"/>
+            </w:tcMar>
+          </w:tcPr>
+          <w:p>
+            <w:pPr>
+              <w:spacing w:after="0" w:line="252"/>
+              <w:jc w:val="left"/>
+            </w:pPr>
+            <w:r>
+              <w:rPr>
+                <w:color w:val="1A1A1A"/>
+                <w:sz w:val="19"/>
+                <w:szCs w:val="19"/>
+              </w:rPr>
+              <w:t xml:space="preserve">External watchdog pings (healthchecks.io)</w:t>
+            </w:r>
+          </w:p>
+        </w:tc>
+      </w:tr>
+      <w:tr>
+        <w:tc>
+          <w:tcPr>
+            <w:tcW w:type="dxa" w:w="2419"/>
+            <w:shd w:fill="FFFFFF" w:val="clear"/>
+            <w:tcMar>
+              <w:top w:type="dxa" w:w="90"/>
+              <w:left w:type="dxa" w:w="130"/>
+              <w:bottom w:type="dxa" w:w="90"/>
+              <w:right w:type="dxa" w:w="130"/>
+            </w:tcMar>
+          </w:tcPr>
+          <w:p>
+            <w:pPr>
+              <w:spacing w:after="0" w:line="252"/>
+              <w:jc w:val="left"/>
+            </w:pPr>
+            <w:r>
+              <w:rPr>
+                <w:rFonts w:ascii="Consolas" w:cs="Consolas" w:eastAsia="Consolas" w:hAnsi="Consolas"/>
+                <w:color w:val="1A1A1A"/>
+                <w:sz w:val="19"/>
+                <w:szCs w:val="19"/>
+              </w:rPr>
               <w:t xml:space="preserve">test_strategy.py</w:t>
             </w:r>
           </w:p>
@@ -1568,7 +1740,7 @@
     </w:p>
     <w:p>
       <w:r>
-        <w:t xml:space="preserve">Nothing. launchd runs it. A push notification arrives each morning with the signal, the position and the paper equity.</w:t>
+        <w:t xml:space="preserve">Nothing. GitHub Actions runs it at 07:00 UTC. A push notification arrives each morning with the signal, the position and the paper equity, and healthchecks.io emails you if a day is ever missed entirely.</w:t>
       </w:r>
     </w:p>
     <w:p>
@@ -1687,6 +1859,16 @@
       </w:pPr>
       <w:r>
         <w:t xml:space="preserve">.venv/bin/python3 backtest.py --start 2018-01-01 --end 2019-12-31</w:t>
+      </w:r>
+    </w:p>
+    <w:p>
+      <w:pPr>
+        <w:pStyle w:val="Code"/>
+        <w:shd w:fill="F2F5F7" w:val="clear"/>
+        <w:spacing w:after="0" w:before="0"/>
+      </w:pPr>
+      <w:r>
+        <w:t xml:space="preserve">.venv/bin/python3 walkforward.py                   # rolling out-of-sample test</w:t>
       </w:r>
     </w:p>
     <w:p>
@@ -1761,7 +1943,7 @@
         <w:pStyle w:val="Heading3"/>
       </w:pPr>
       <w:r>
-        <w:t xml:space="preserve">Reinstalling the schedule after editing the plist</w:t>
+        <w:t xml:space="preserve">Re-enabling the local scheduler (only if CI is abandoned)</w:t>
       </w:r>
     </w:p>
     <w:p>
@@ -1825,7 +2007,7 @@
     </w:p>
     <w:p>
       <w:r>
-        <w:t xml:space="preserve">Three triggers — boot/login, 08:00 and 20:00 — which only works because the run is idempotent. A per-day marker file means whichever trigger fires first does the work and the rest exit immediately. The marker is written only when the signal computed AND the notification was delivered, so a failed push is retried by a later trigger rather than being recorded as done.</w:t>
+        <w:t xml:space="preserve">GitHub Actions is now the only runner, and the local job is disabled so two runners cannot both write the ledger. The local design is retained as a fallback: three triggers — boot/login, 08:00 and 20:00 — which only works because the run is idempotent. A per-day marker file means whichever trigger fires first does the work and the rest exit immediately. The marker is written only when the signal computed AND the notification was delivered, so a failed push is retried by a later trigger rather than being recorded as done.</w:t>
       </w:r>
     </w:p>
     <w:p>
@@ -1843,7 +2025,7 @@
     </w:p>
     <w:p>
       <w:r>
-        <w:t xml:space="preserve">Kraken is primary because it is the venue the strategy would actually trade — signal and fill price come from the same order book. Coinbase is the first fallback, another real exchange API. yfinance is last because it is a scraper and is currently broken. Each source gets three attempts with exponential backoff.</w:t>
+        <w:t xml:space="preserve">Kraken is primary because it is the venue the strategy would actually trade — signal and fill price come from the same order book. Coinbase is the first fallback, another real exchange API. yfinance was removed entirely after Yahoo changed its response format and every request failed — a fallback that does not work is worse than none, because it hides the real failure behind a second one. Each source gets three attempts with exponential backoff.</w:t>
       </w:r>
     </w:p>
     <w:p>
@@ -2227,7 +2409,7 @@
                 <w:sz w:val="19"/>
                 <w:szCs w:val="19"/>
               </w:rPr>
-              <w:t xml:space="preserve">The sweep favours shorter long-MAs, but choosing them on the same data would be overfitting. Needs walk-forward validation first</w:t>
+              <w:t xml:space="preserve">Walk-forward found three different winning pairs across seven fit windows. The sweep result is noise and the parameters should not be changed</w:t>
             </w:r>
           </w:p>
         </w:tc>
@@ -2611,7 +2793,7 @@
                 <w:sz w:val="19"/>
                 <w:szCs w:val="19"/>
               </w:rPr>
-              <w:t xml:space="preserve">Git</w:t>
+              <w:t xml:space="preserve">Repository</w:t>
             </w:r>
           </w:p>
         </w:tc>
@@ -2637,7 +2819,7 @@
                 <w:sz w:val="19"/>
                 <w:szCs w:val="19"/>
               </w:rPr>
-              <w:t xml:space="preserve">7 commits, no secrets in history</w:t>
+              <w:t xml:space="preserve">github.com/bsvirk02/trading-bot (public)</w:t>
             </w:r>
           </w:p>
         </w:tc>
@@ -2665,7 +2847,7 @@
                 <w:sz w:val="19"/>
                 <w:szCs w:val="19"/>
               </w:rPr>
-              <w:t xml:space="preserve">Schedule</w:t>
+              <w:t xml:space="preserve">Runner</w:t>
             </w:r>
           </w:p>
         </w:tc>
@@ -2691,7 +2873,7 @@
                 <w:sz w:val="19"/>
                 <w:szCs w:val="19"/>
               </w:rPr>
-              <w:t xml:space="preserve">Installed and verified — fired on bootstrap at 13:26</w:t>
+              <w:t xml:space="preserve">GitHub Actions, daily 07:00 UTC — first run green in 28s</w:t>
             </w:r>
           </w:p>
         </w:tc>
@@ -2719,6 +2901,168 @@
                 <w:sz w:val="19"/>
                 <w:szCs w:val="19"/>
               </w:rPr>
+              <w:t xml:space="preserve">Local scheduler</w:t>
+            </w:r>
+          </w:p>
+        </w:tc>
+        <w:tc>
+          <w:tcPr>
+            <w:tcW w:type="dxa" w:w="7056"/>
+            <w:shd w:fill="FFFFFF" w:val="clear"/>
+            <w:tcMar>
+              <w:top w:type="dxa" w:w="90"/>
+              <w:left w:type="dxa" w:w="130"/>
+              <w:bottom w:type="dxa" w:w="90"/>
+              <w:right w:type="dxa" w:w="130"/>
+            </w:tcMar>
+          </w:tcPr>
+          <w:p>
+            <w:pPr>
+              <w:spacing w:after="0" w:line="252"/>
+              <w:jc w:val="left"/>
+            </w:pPr>
+            <w:r>
+              <w:rPr>
+                <w:color w:val="1A1A1A"/>
+                <w:sz w:val="19"/>
+                <w:szCs w:val="19"/>
+              </w:rPr>
+              <w:t xml:space="preserve">Disabled, so only one runner writes the ledger</w:t>
+            </w:r>
+          </w:p>
+        </w:tc>
+      </w:tr>
+      <w:tr>
+        <w:tc>
+          <w:tcPr>
+            <w:tcW w:type="dxa" w:w="3024"/>
+            <w:shd w:fill="F6F9FA" w:val="clear"/>
+            <w:tcMar>
+              <w:top w:type="dxa" w:w="90"/>
+              <w:left w:type="dxa" w:w="130"/>
+              <w:bottom w:type="dxa" w:w="90"/>
+              <w:right w:type="dxa" w:w="130"/>
+            </w:tcMar>
+          </w:tcPr>
+          <w:p>
+            <w:pPr>
+              <w:spacing w:after="0" w:line="252"/>
+              <w:jc w:val="left"/>
+            </w:pPr>
+            <w:r>
+              <w:rPr>
+                <w:color w:val="1A1A1A"/>
+                <w:sz w:val="19"/>
+                <w:szCs w:val="19"/>
+              </w:rPr>
+              <w:t xml:space="preserve">Watchdog</w:t>
+            </w:r>
+          </w:p>
+        </w:tc>
+        <w:tc>
+          <w:tcPr>
+            <w:tcW w:type="dxa" w:w="7056"/>
+            <w:shd w:fill="F6F9FA" w:val="clear"/>
+            <w:tcMar>
+              <w:top w:type="dxa" w:w="90"/>
+              <w:left w:type="dxa" w:w="130"/>
+              <w:bottom w:type="dxa" w:w="90"/>
+              <w:right w:type="dxa" w:w="130"/>
+            </w:tcMar>
+          </w:tcPr>
+          <w:p>
+            <w:pPr>
+              <w:spacing w:after="0" w:line="252"/>
+              <w:jc w:val="left"/>
+            </w:pPr>
+            <w:r>
+              <w:rPr>
+                <w:color w:val="1A1A1A"/>
+                <w:sz w:val="19"/>
+                <w:szCs w:val="19"/>
+              </w:rPr>
+              <w:t xml:space="preserve">healthchecks.io — 1 day period, 2 hour grace</w:t>
+            </w:r>
+          </w:p>
+        </w:tc>
+      </w:tr>
+      <w:tr>
+        <w:tc>
+          <w:tcPr>
+            <w:tcW w:type="dxa" w:w="3024"/>
+            <w:shd w:fill="FFFFFF" w:val="clear"/>
+            <w:tcMar>
+              <w:top w:type="dxa" w:w="90"/>
+              <w:left w:type="dxa" w:w="130"/>
+              <w:bottom w:type="dxa" w:w="90"/>
+              <w:right w:type="dxa" w:w="130"/>
+            </w:tcMar>
+          </w:tcPr>
+          <w:p>
+            <w:pPr>
+              <w:spacing w:after="0" w:line="252"/>
+              <w:jc w:val="left"/>
+            </w:pPr>
+            <w:r>
+              <w:rPr>
+                <w:color w:val="1A1A1A"/>
+                <w:sz w:val="19"/>
+                <w:szCs w:val="19"/>
+              </w:rPr>
+              <w:t xml:space="preserve">Python</w:t>
+            </w:r>
+          </w:p>
+        </w:tc>
+        <w:tc>
+          <w:tcPr>
+            <w:tcW w:type="dxa" w:w="7056"/>
+            <w:shd w:fill="FFFFFF" w:val="clear"/>
+            <w:tcMar>
+              <w:top w:type="dxa" w:w="90"/>
+              <w:left w:type="dxa" w:w="130"/>
+              <w:bottom w:type="dxa" w:w="90"/>
+              <w:right w:type="dxa" w:w="130"/>
+            </w:tcMar>
+          </w:tcPr>
+          <w:p>
+            <w:pPr>
+              <w:spacing w:after="0" w:line="252"/>
+              <w:jc w:val="left"/>
+            </w:pPr>
+            <w:r>
+              <w:rPr>
+                <w:color w:val="1A1A1A"/>
+                <w:sz w:val="19"/>
+                <w:szCs w:val="19"/>
+              </w:rPr>
+              <w:t xml:space="preserve">3.13 (Homebrew); three dependencies</w:t>
+            </w:r>
+          </w:p>
+        </w:tc>
+      </w:tr>
+      <w:tr>
+        <w:tc>
+          <w:tcPr>
+            <w:tcW w:type="dxa" w:w="3024"/>
+            <w:shd w:fill="F6F9FA" w:val="clear"/>
+            <w:tcMar>
+              <w:top w:type="dxa" w:w="90"/>
+              <w:left w:type="dxa" w:w="130"/>
+              <w:bottom w:type="dxa" w:w="90"/>
+              <w:right w:type="dxa" w:w="130"/>
+            </w:tcMar>
+          </w:tcPr>
+          <w:p>
+            <w:pPr>
+              <w:spacing w:after="0" w:line="252"/>
+              <w:jc w:val="left"/>
+            </w:pPr>
+            <w:r>
+              <w:rPr>
+                <w:color w:val="1A1A1A"/>
+                <w:sz w:val="19"/>
+                <w:szCs w:val="19"/>
+              </w:rPr>
               <w:t xml:space="preserve">Tests</w:t>
             </w:r>
           </w:p>
@@ -2726,7 +3070,7 @@
         <w:tc>
           <w:tcPr>
             <w:tcW w:type="dxa" w:w="7056"/>
-            <w:shd w:fill="FFFFFF" w:val="clear"/>
+            <w:shd w:fill="F6F9FA" w:val="clear"/>
             <w:tcMar>
               <w:top w:type="dxa" w:w="90"/>
               <w:left w:type="dxa" w:w="130"/>
@@ -2761,7 +3105,7 @@
     </w:p>
     <w:p>
       <w:r>
-        <w:t xml:space="preserve">Two of these block any move to real money.</w:t>
+        <w:t xml:space="preserve">The two items that previously blocked any move to real money have both been resolved — and one of them resolved by answering "no".</w:t>
       </w:r>
     </w:p>
     <w:p>
@@ -2769,7 +3113,7 @@
         <w:pStyle w:val="Heading3"/>
       </w:pPr>
       <w:r>
-        <w:t xml:space="preserve">Blocking</w:t>
+        <w:t xml:space="preserve">Closed</w:t>
       </w:r>
     </w:p>
     <w:p>
@@ -2786,10 +3130,10 @@
           <w:b/>
           <w:bCs/>
         </w:rPr>
-        <w:t xml:space="preserve">Walk-forward validation. </w:t>
-      </w:r>
-      <w:r>
-        <w:t xml:space="preserve">The parameter sweep favours a shorter long-MA, but acting on that without rolling out-of-sample testing is overfitting. Until this is done, no parameter should change.</w:t>
+        <w:t xml:space="preserve">Walk-forward validation — done, and the answer is negative. </w:t>
+      </w:r>
+      <w:r>
+        <w:t xml:space="preserve">Across seven out-of-sample windows, buy and hold compounded 1,098.8% against the strategy’s 916.9%. Three different parameter pairs won the fit windows, so the sweep result was noise and the parameters stay at 5/150.</w:t>
       </w:r>
     </w:p>
     <w:p>
@@ -2806,18 +3150,10 @@
           <w:b/>
           <w:bCs/>
         </w:rPr>
-        <w:t xml:space="preserve">The bot only runs when the laptop is awake. </w:t>
-      </w:r>
-      <w:r>
-        <w:t xml:space="preserve">The three triggers and the catch-up guard mitigate this; they do not solve it. A missed exit signal in a falling market is exactly the failure that costs money. The fix is an always-on host — EventBridge plus Lambda, or a t4g.nano, pennies a month, and a concrete cloud deployment worth talking about in interviews.</w:t>
-      </w:r>
-    </w:p>
-    <w:p>
-      <w:pPr>
-        <w:pStyle w:val="Heading3"/>
-      </w:pPr>
-      <w:r>
-        <w:t xml:space="preserve">Non-blocking</w:t>
+        <w:t xml:space="preserve">Hosting — done. </w:t>
+      </w:r>
+      <w:r>
+        <w:t xml:space="preserve">The bot runs on GitHub Actions and no longer depends on the laptop. The local launchd job is disabled so only one runner writes the ledger.</w:t>
       </w:r>
     </w:p>
     <w:p>
@@ -2834,10 +3170,10 @@
           <w:b/>
           <w:bCs/>
         </w:rPr>
-        <w:t xml:space="preserve">Python 3.9 is end-of-life. </w:t>
-      </w:r>
-      <w:r>
-        <w:t xml:space="preserve">It is why every run prints a LibreSSL warning. brew install python@3.13 and recreate the venv — roughly ten minutes.</w:t>
+        <w:t xml:space="preserve">Dead-man’s switch — done. </w:t>
+      </w:r>
+      <w:r>
+        <w:t xml:space="preserve">healthchecks.io expects a daily ping and emails if one does not arrive. It detects the case on-machine alerting structurally cannot: a run that never happened.</w:t>
       </w:r>
     </w:p>
     <w:p>
@@ -2854,10 +3190,18 @@
           <w:b/>
           <w:bCs/>
         </w:rPr>
-        <w:t xml:space="preserve">yfinance is broken. </w:t>
-      </w:r>
-      <w:r>
-        <w:t xml:space="preserve">Yahoo changed its response format. It is the third fallback behind two working exchange APIs, so nothing depends on it, but it should be either upgraded or dropped.</w:t>
+        <w:t xml:space="preserve">Python 3.9 — done. </w:t>
+      </w:r>
+      <w:r>
+        <w:t xml:space="preserve">Now on 3.13. matplotlib and yfinance both removed; three dependencies remain.</w:t>
+      </w:r>
+    </w:p>
+    <w:p>
+      <w:pPr>
+        <w:pStyle w:val="Heading3"/>
+      </w:pPr>
+      <w:r>
+        <w:t xml:space="preserve">Still open</w:t>
       </w:r>
     </w:p>
     <w:p>
@@ -2874,10 +3218,50 @@
           <w:b/>
           <w:bCs/>
         </w:rPr>
-        <w:t xml:space="preserve">No dead-man’s switch. </w:t>
-      </w:r>
-      <w:r>
-        <w:t xml:space="preserve">If the bot never runs at all, nothing alerts. Failure alerting covers a run that fails, not a run that never happens. This needs something external to the machine — and largely disappears once the bot is hosted.</w:t>
+        <w:t xml:space="preserve">The strategy is not worth funding as it stands. </w:t>
+      </w:r>
+      <w:r>
+        <w:t xml:space="preserve">This is the real open item. The infrastructure works; the edge does not. Paper trading continues and will produce a live record over the coming months.</w:t>
+      </w:r>
+    </w:p>
+    <w:p>
+      <w:pPr>
+        <w:pStyle w:val="ListParagraph"/>
+        <w:numPr>
+          <w:ilvl w:val="0"/>
+          <w:numId w:val="2"/>
+        </w:numPr>
+        <w:spacing w:after="80"/>
+      </w:pPr>
+      <w:r>
+        <w:rPr>
+          <w:b/>
+          <w:bCs/>
+        </w:rPr>
+        <w:t xml:space="preserve">Live trading is unimplemented, deliberately. </w:t>
+      </w:r>
+      <w:r>
+        <w:t xml:space="preserve">KrakenBroker raises on construction and MODE=live is refused. Implementing it needs a fresh Kraken key with order permissions and no withdrawal rights — and a reason, which does not currently exist.</w:t>
+      </w:r>
+    </w:p>
+    <w:p>
+      <w:pPr>
+        <w:pStyle w:val="ListParagraph"/>
+        <w:numPr>
+          <w:ilvl w:val="0"/>
+          <w:numId w:val="2"/>
+        </w:numPr>
+        <w:spacing w:after="80"/>
+      </w:pPr>
+      <w:r>
+        <w:rPr>
+          <w:b/>
+          <w:bCs/>
+        </w:rPr>
+        <w:t xml:space="preserve">AWS deployment, optional. </w:t>
+      </w:r>
+      <w:r>
+        <w:t xml:space="preserve">GitHub Actions solved the hosting problem for nothing. Rebuilding it on EventBridge and Lambda with Terraform or CDK would be a stronger portfolio piece, but it is a separate project with its own justification, not a fix for anything.</w:t>
       </w:r>
     </w:p>
     <w:p>
@@ -2895,7 +3279,7 @@
     </w:p>
     <w:p>
       <w:r>
-        <w:t xml:space="preserve">Then run test_strategy.py to confirm the environment works, and backtest.py --periods to see where the strategy stands. The companion document, BTC Trend Strategy — Validation Analysis, covers whether the strategy is worth trading at all. The short answer is that it reduces drawdown rather than generating return, and should not be traded with real money on the current evidence.</w:t>
+        <w:t xml:space="preserve">Then run test_strategy.py to confirm the environment works, and backtest.py --periods to see where the strategy stands. The companion document, BTC Trend Strategy — Validation Analysis, covers whether the strategy is worth trading at all. The short answer is that walk-forward validation showed buy and hold beating it on return across every out-of-sample window tested, and that it should not be traded with real money.</w:t>
       </w:r>
     </w:p>
     <w:sectPr>

</xml_diff>